<commit_message>
final manuscript full and short
</commit_message>
<xml_diff>
--- a/manuscript/manuscript.docx
+++ b/manuscript/manuscript.docx
@@ -9797,7 +9797,7 @@
       </w:r>
     </w:p>
     <w:bookmarkEnd w:id="88"/>
-    <w:bookmarkStart w:id="89" w:name="availability-of-data-and-software-code"/>
+    <w:bookmarkStart w:id="89" w:name="funding"/>
     <w:p>
       <w:pPr>
         <w:pStyle w:val="Heading1"/>
@@ -9807,6 +9807,57 @@
           <w:rStyle w:val="SectionNumber"/>
         </w:rPr>
         <w:t xml:space="preserve">8</w:t>
+      </w:r>
+      <w:r>
+        <w:tab/>
+      </w:r>
+      <w:r>
+        <w:t xml:space="preserve">Funding</w:t>
+      </w:r>
+    </w:p>
+    <w:p>
+      <w:pPr>
+        <w:pStyle w:val="FirstParagraph"/>
+      </w:pPr>
+      <w:r>
+        <w:t xml:space="preserve">This study was co-funded by the BIRD 2024/START (SID) programs, Department of Cardio-Thoracic-Vascular Sciences (DCTV), University of Padua (PI: Daniele Sabbatini; 2024DCTV1SIDPROGETTI-00183) and by the Italian Complementary National Plan PNC-I.1</w:t>
+      </w:r>
+      <w:r>
+        <w:t xml:space="preserve"> </w:t>
+      </w:r>
+      <w:r>
+        <w:t xml:space="preserve">“Research initiatives for innovative technologies and pathways in the health and welfare sector”</w:t>
+      </w:r>
+      <w:r>
+        <w:t xml:space="preserve"> </w:t>
+      </w:r>
+      <w:r>
+        <w:t xml:space="preserve">D.D. 931 of 06/06/2022,</w:t>
+      </w:r>
+      <w:r>
+        <w:t xml:space="preserve"> </w:t>
+      </w:r>
+      <w:r>
+        <w:t xml:space="preserve">“DARE-DigitAl lifelong pRevEntion”</w:t>
+      </w:r>
+      <w:r>
+        <w:t xml:space="preserve"> </w:t>
+      </w:r>
+      <w:r>
+        <w:t xml:space="preserve">initiative, code PNC0000002, CUP: B53C22006450001.</w:t>
+      </w:r>
+    </w:p>
+    <w:bookmarkEnd w:id="89"/>
+    <w:bookmarkStart w:id="90" w:name="availability-of-data-and-software-code"/>
+    <w:p>
+      <w:pPr>
+        <w:pStyle w:val="Heading1"/>
+      </w:pPr>
+      <w:r>
+        <w:rPr>
+          <w:rStyle w:val="SectionNumber"/>
+        </w:rPr>
+        <w:t xml:space="preserve">9</w:t>
       </w:r>
       <w:r>
         <w:tab/>
@@ -9843,8 +9894,8 @@
         <w:t xml:space="preserve">.</w:t>
       </w:r>
     </w:p>
-    <w:bookmarkEnd w:id="89"/>
-    <w:bookmarkStart w:id="155" w:name="references"/>
+    <w:bookmarkEnd w:id="90"/>
+    <w:bookmarkStart w:id="156" w:name="references"/>
     <w:p>
       <w:pPr>
         <w:pStyle w:val="Heading1"/>
@@ -9853,8 +9904,8 @@
         <w:t xml:space="preserve">References</w:t>
       </w:r>
     </w:p>
-    <w:bookmarkStart w:id="154" w:name="refs"/>
-    <w:bookmarkStart w:id="91" w:name="ref-Regev2017"/>
+    <w:bookmarkStart w:id="155" w:name="refs"/>
+    <w:bookmarkStart w:id="92" w:name="ref-Regev2017"/>
     <w:p>
       <w:pPr>
         <w:pStyle w:val="Bibliography"/>
@@ -9915,7 +9966,7 @@
       <w:r>
         <w:t xml:space="preserve"> </w:t>
       </w:r>
-      <w:hyperlink r:id="rId90">
+      <w:hyperlink r:id="rId91">
         <w:r>
           <w:rPr>
             <w:rStyle w:val="Hyperlink"/>
@@ -9927,8 +9978,8 @@
         <w:t xml:space="preserve">.</w:t>
       </w:r>
     </w:p>
-    <w:bookmarkEnd w:id="91"/>
-    <w:bookmarkStart w:id="93" w:name="ref-TabulaSapiens2022"/>
+    <w:bookmarkEnd w:id="92"/>
+    <w:bookmarkStart w:id="94" w:name="ref-TabulaSapiens2022"/>
     <w:p>
       <w:pPr>
         <w:pStyle w:val="Bibliography"/>
@@ -9976,7 +10027,7 @@
       <w:r>
         <w:t xml:space="preserve"> </w:t>
       </w:r>
-      <w:hyperlink r:id="rId92">
+      <w:hyperlink r:id="rId93">
         <w:r>
           <w:rPr>
             <w:rStyle w:val="Hyperlink"/>
@@ -9988,8 +10039,8 @@
         <w:t xml:space="preserve">.</w:t>
       </w:r>
     </w:p>
-    <w:bookmarkEnd w:id="93"/>
-    <w:bookmarkStart w:id="95" w:name="ref-Yao2023"/>
+    <w:bookmarkEnd w:id="94"/>
+    <w:bookmarkStart w:id="96" w:name="ref-Yao2023"/>
     <w:p>
       <w:pPr>
         <w:pStyle w:val="Bibliography"/>
@@ -10041,7 +10092,7 @@
       <w:r>
         <w:t xml:space="preserve"> </w:t>
       </w:r>
-      <w:hyperlink r:id="rId94">
+      <w:hyperlink r:id="rId95">
         <w:r>
           <w:rPr>
             <w:rStyle w:val="Hyperlink"/>
@@ -10053,8 +10104,8 @@
         <w:t xml:space="preserve">.</w:t>
       </w:r>
     </w:p>
-    <w:bookmarkEnd w:id="95"/>
-    <w:bookmarkStart w:id="97" w:name="ref-Wolf2018"/>
+    <w:bookmarkEnd w:id="96"/>
+    <w:bookmarkStart w:id="98" w:name="ref-Wolf2018"/>
     <w:p>
       <w:pPr>
         <w:pStyle w:val="Bibliography"/>
@@ -10099,7 +10150,7 @@
       <w:r>
         <w:t xml:space="preserve"> </w:t>
       </w:r>
-      <w:hyperlink r:id="rId96">
+      <w:hyperlink r:id="rId97">
         <w:r>
           <w:rPr>
             <w:rStyle w:val="Hyperlink"/>
@@ -10111,8 +10162,8 @@
         <w:t xml:space="preserve">.</w:t>
       </w:r>
     </w:p>
-    <w:bookmarkEnd w:id="97"/>
-    <w:bookmarkStart w:id="99" w:name="ref-Traag2019"/>
+    <w:bookmarkEnd w:id="98"/>
+    <w:bookmarkStart w:id="100" w:name="ref-Traag2019"/>
     <w:p>
       <w:pPr>
         <w:pStyle w:val="Bibliography"/>
@@ -10172,7 +10223,7 @@
       <w:r>
         <w:t xml:space="preserve"> </w:t>
       </w:r>
-      <w:hyperlink r:id="rId98">
+      <w:hyperlink r:id="rId99">
         <w:r>
           <w:rPr>
             <w:rStyle w:val="Hyperlink"/>
@@ -10184,8 +10235,8 @@
         <w:t xml:space="preserve">.</w:t>
       </w:r>
     </w:p>
-    <w:bookmarkEnd w:id="99"/>
-    <w:bookmarkStart w:id="101" w:name="ref-McInnes2018"/>
+    <w:bookmarkEnd w:id="100"/>
+    <w:bookmarkStart w:id="102" w:name="ref-McInnes2018"/>
     <w:p>
       <w:pPr>
         <w:pStyle w:val="Bibliography"/>
@@ -10230,7 +10281,7 @@
       <w:r>
         <w:t xml:space="preserve"> </w:t>
       </w:r>
-      <w:hyperlink r:id="rId100">
+      <w:hyperlink r:id="rId101">
         <w:r>
           <w:rPr>
             <w:rStyle w:val="Hyperlink"/>
@@ -10242,8 +10293,8 @@
         <w:t xml:space="preserve">.</w:t>
       </w:r>
     </w:p>
-    <w:bookmarkEnd w:id="101"/>
-    <w:bookmarkStart w:id="103" w:name="ref-Palla2022"/>
+    <w:bookmarkEnd w:id="102"/>
+    <w:bookmarkStart w:id="104" w:name="ref-Palla2022"/>
     <w:p>
       <w:pPr>
         <w:pStyle w:val="Bibliography"/>
@@ -10301,7 +10352,7 @@
       <w:r>
         <w:t xml:space="preserve"> </w:t>
       </w:r>
-      <w:hyperlink r:id="rId102">
+      <w:hyperlink r:id="rId103">
         <w:r>
           <w:rPr>
             <w:rStyle w:val="Hyperlink"/>
@@ -10313,8 +10364,8 @@
         <w:t xml:space="preserve">.</w:t>
       </w:r>
     </w:p>
-    <w:bookmarkEnd w:id="103"/>
-    <w:bookmarkStart w:id="105" w:name="ref-RAPIDS2024"/>
+    <w:bookmarkEnd w:id="104"/>
+    <w:bookmarkStart w:id="106" w:name="ref-RAPIDS2024"/>
     <w:p>
       <w:pPr>
         <w:pStyle w:val="Bibliography"/>
@@ -10364,7 +10415,7 @@
       <w:r>
         <w:t xml:space="preserve"> </w:t>
       </w:r>
-      <w:hyperlink r:id="rId104">
+      <w:hyperlink r:id="rId105">
         <w:r>
           <w:rPr>
             <w:rStyle w:val="Hyperlink"/>
@@ -10373,8 +10424,8 @@
         </w:r>
       </w:hyperlink>
     </w:p>
-    <w:bookmarkEnd w:id="105"/>
-    <w:bookmarkStart w:id="107" w:name="ref-Dicks2026"/>
+    <w:bookmarkEnd w:id="106"/>
+    <w:bookmarkStart w:id="108" w:name="ref-Dicks2026"/>
     <w:p>
       <w:pPr>
         <w:pStyle w:val="Bibliography"/>
@@ -10432,7 +10483,7 @@
       <w:r>
         <w:t xml:space="preserve"> </w:t>
       </w:r>
-      <w:hyperlink r:id="rId106">
+      <w:hyperlink r:id="rId107">
         <w:r>
           <w:rPr>
             <w:rStyle w:val="Hyperlink"/>
@@ -10444,8 +10495,8 @@
         <w:t xml:space="preserve">.</w:t>
       </w:r>
     </w:p>
-    <w:bookmarkEnd w:id="107"/>
-    <w:bookmarkStart w:id="109" w:name="ref-TaylorWeiner2019"/>
+    <w:bookmarkEnd w:id="108"/>
+    <w:bookmarkStart w:id="110" w:name="ref-TaylorWeiner2019"/>
     <w:p>
       <w:pPr>
         <w:pStyle w:val="Bibliography"/>
@@ -10506,7 +10557,7 @@
       <w:r>
         <w:t xml:space="preserve"> </w:t>
       </w:r>
-      <w:hyperlink r:id="rId108">
+      <w:hyperlink r:id="rId109">
         <w:r>
           <w:rPr>
             <w:rStyle w:val="Hyperlink"/>
@@ -10518,8 +10569,8 @@
         <w:t xml:space="preserve">.</w:t>
       </w:r>
     </w:p>
-    <w:bookmarkEnd w:id="109"/>
-    <w:bookmarkStart w:id="111" w:name="ref-Nolet2022"/>
+    <w:bookmarkEnd w:id="110"/>
+    <w:bookmarkStart w:id="112" w:name="ref-Nolet2022"/>
     <w:p>
       <w:pPr>
         <w:pStyle w:val="Bibliography"/>
@@ -10580,7 +10631,7 @@
       <w:r>
         <w:t xml:space="preserve"> </w:t>
       </w:r>
-      <w:hyperlink r:id="rId110">
+      <w:hyperlink r:id="rId111">
         <w:r>
           <w:rPr>
             <w:rStyle w:val="Hyperlink"/>
@@ -10592,8 +10643,8 @@
         <w:t xml:space="preserve">.</w:t>
       </w:r>
     </w:p>
-    <w:bookmarkEnd w:id="111"/>
-    <w:bookmarkStart w:id="113" w:name="ref-Hu2025"/>
+    <w:bookmarkEnd w:id="112"/>
+    <w:bookmarkStart w:id="114" w:name="ref-Hu2025"/>
     <w:p>
       <w:pPr>
         <w:pStyle w:val="Bibliography"/>
@@ -10669,7 +10720,7 @@
       <w:r>
         <w:t xml:space="preserve"> </w:t>
       </w:r>
-      <w:hyperlink r:id="rId112">
+      <w:hyperlink r:id="rId113">
         <w:r>
           <w:rPr>
             <w:rStyle w:val="Hyperlink"/>
@@ -10681,8 +10732,8 @@
         <w:t xml:space="preserve">.</w:t>
       </w:r>
     </w:p>
-    <w:bookmarkEnd w:id="113"/>
-    <w:bookmarkStart w:id="115" w:name="ref-Gardner2025"/>
+    <w:bookmarkEnd w:id="114"/>
+    <w:bookmarkStart w:id="116" w:name="ref-Gardner2025"/>
     <w:p>
       <w:pPr>
         <w:pStyle w:val="Bibliography"/>
@@ -10748,7 +10799,7 @@
       <w:r>
         <w:t xml:space="preserve"> </w:t>
       </w:r>
-      <w:hyperlink r:id="rId114">
+      <w:hyperlink r:id="rId115">
         <w:r>
           <w:rPr>
             <w:rStyle w:val="Hyperlink"/>
@@ -10760,8 +10811,8 @@
         <w:t xml:space="preserve">.</w:t>
       </w:r>
     </w:p>
-    <w:bookmarkEnd w:id="115"/>
-    <w:bookmarkStart w:id="117" w:name="ref-Zheng2017"/>
+    <w:bookmarkEnd w:id="116"/>
+    <w:bookmarkStart w:id="118" w:name="ref-Zheng2017"/>
     <w:p>
       <w:pPr>
         <w:pStyle w:val="Bibliography"/>
@@ -10813,7 +10864,7 @@
       <w:r>
         <w:t xml:space="preserve"> </w:t>
       </w:r>
-      <w:hyperlink r:id="rId116">
+      <w:hyperlink r:id="rId117">
         <w:r>
           <w:rPr>
             <w:rStyle w:val="Hyperlink"/>
@@ -10825,8 +10876,8 @@
         <w:t xml:space="preserve">.</w:t>
       </w:r>
     </w:p>
-    <w:bookmarkEnd w:id="117"/>
-    <w:bookmarkStart w:id="119" w:name="ref-Luecken2019"/>
+    <w:bookmarkEnd w:id="118"/>
+    <w:bookmarkStart w:id="120" w:name="ref-Luecken2019"/>
     <w:p>
       <w:pPr>
         <w:pStyle w:val="Bibliography"/>
@@ -10877,7 +10928,7 @@
       <w:r>
         <w:t xml:space="preserve"> </w:t>
       </w:r>
-      <w:hyperlink r:id="rId118">
+      <w:hyperlink r:id="rId119">
         <w:r>
           <w:rPr>
             <w:rStyle w:val="Hyperlink"/>
@@ -10889,8 +10940,8 @@
         <w:t xml:space="preserve">.</w:t>
       </w:r>
     </w:p>
-    <w:bookmarkEnd w:id="119"/>
-    <w:bookmarkStart w:id="121" w:name="ref-Heumos2023"/>
+    <w:bookmarkEnd w:id="120"/>
+    <w:bookmarkStart w:id="122" w:name="ref-Heumos2023"/>
     <w:p>
       <w:pPr>
         <w:pStyle w:val="Bibliography"/>
@@ -10942,7 +10993,7 @@
       <w:r>
         <w:t xml:space="preserve"> </w:t>
       </w:r>
-      <w:hyperlink r:id="rId120">
+      <w:hyperlink r:id="rId121">
         <w:r>
           <w:rPr>
             <w:rStyle w:val="Hyperlink"/>
@@ -10954,8 +11005,8 @@
         <w:t xml:space="preserve">.</w:t>
       </w:r>
     </w:p>
-    <w:bookmarkEnd w:id="121"/>
-    <w:bookmarkStart w:id="123" w:name="ref-Virshup2024"/>
+    <w:bookmarkEnd w:id="122"/>
+    <w:bookmarkStart w:id="124" w:name="ref-Virshup2024"/>
     <w:p>
       <w:pPr>
         <w:pStyle w:val="Bibliography"/>
@@ -10994,7 +11045,7 @@
       <w:r>
         <w:t xml:space="preserve"> </w:t>
       </w:r>
-      <w:hyperlink r:id="rId122">
+      <w:hyperlink r:id="rId123">
         <w:r>
           <w:rPr>
             <w:rStyle w:val="Hyperlink"/>
@@ -11006,8 +11057,8 @@
         <w:t xml:space="preserve">.</w:t>
       </w:r>
     </w:p>
-    <w:bookmarkEnd w:id="123"/>
-    <w:bookmarkStart w:id="125" w:name="ref-Satija2015"/>
+    <w:bookmarkEnd w:id="124"/>
+    <w:bookmarkStart w:id="126" w:name="ref-Satija2015"/>
     <w:p>
       <w:pPr>
         <w:pStyle w:val="Bibliography"/>
@@ -11046,7 +11097,7 @@
       <w:r>
         <w:t xml:space="preserve"> </w:t>
       </w:r>
-      <w:hyperlink r:id="rId124">
+      <w:hyperlink r:id="rId125">
         <w:r>
           <w:rPr>
             <w:rStyle w:val="Hyperlink"/>
@@ -11058,8 +11109,8 @@
         <w:t xml:space="preserve">.</w:t>
       </w:r>
     </w:p>
-    <w:bookmarkEnd w:id="125"/>
-    <w:bookmarkStart w:id="127" w:name="ref-Yip2019"/>
+    <w:bookmarkEnd w:id="126"/>
+    <w:bookmarkStart w:id="128" w:name="ref-Yip2019"/>
     <w:p>
       <w:pPr>
         <w:pStyle w:val="Bibliography"/>
@@ -11107,7 +11158,7 @@
       <w:r>
         <w:t xml:space="preserve"> </w:t>
       </w:r>
-      <w:hyperlink r:id="rId126">
+      <w:hyperlink r:id="rId127">
         <w:r>
           <w:rPr>
             <w:rStyle w:val="Hyperlink"/>
@@ -11119,8 +11170,8 @@
         <w:t xml:space="preserve">.</w:t>
       </w:r>
     </w:p>
-    <w:bookmarkEnd w:id="127"/>
-    <w:bookmarkStart w:id="129" w:name="ref-Soneson2018"/>
+    <w:bookmarkEnd w:id="128"/>
+    <w:bookmarkStart w:id="130" w:name="ref-Soneson2018"/>
     <w:p>
       <w:pPr>
         <w:pStyle w:val="Bibliography"/>
@@ -11159,7 +11210,7 @@
       <w:r>
         <w:t xml:space="preserve"> </w:t>
       </w:r>
-      <w:hyperlink r:id="rId128">
+      <w:hyperlink r:id="rId129">
         <w:r>
           <w:rPr>
             <w:rStyle w:val="Hyperlink"/>
@@ -11171,8 +11222,8 @@
         <w:t xml:space="preserve">.</w:t>
       </w:r>
     </w:p>
-    <w:bookmarkEnd w:id="129"/>
-    <w:bookmarkStart w:id="131" w:name="ref-Rocklin2015"/>
+    <w:bookmarkEnd w:id="130"/>
+    <w:bookmarkStart w:id="132" w:name="ref-Rocklin2015"/>
     <w:p>
       <w:pPr>
         <w:pStyle w:val="Bibliography"/>
@@ -11217,7 +11268,7 @@
       <w:r>
         <w:t xml:space="preserve"> </w:t>
       </w:r>
-      <w:hyperlink r:id="rId130">
+      <w:hyperlink r:id="rId131">
         <w:r>
           <w:rPr>
             <w:rStyle w:val="Hyperlink"/>
@@ -11229,8 +11280,8 @@
         <w:t xml:space="preserve">.</w:t>
       </w:r>
     </w:p>
-    <w:bookmarkEnd w:id="131"/>
-    <w:bookmarkStart w:id="133" w:name="ref-Tian2019"/>
+    <w:bookmarkEnd w:id="132"/>
+    <w:bookmarkStart w:id="134" w:name="ref-Tian2019"/>
     <w:p>
       <w:pPr>
         <w:pStyle w:val="Bibliography"/>
@@ -11291,7 +11342,7 @@
       <w:r>
         <w:t xml:space="preserve"> </w:t>
       </w:r>
-      <w:hyperlink r:id="rId132">
+      <w:hyperlink r:id="rId133">
         <w:r>
           <w:rPr>
             <w:rStyle w:val="Hyperlink"/>
@@ -11303,8 +11354,8 @@
         <w:t xml:space="preserve">.</w:t>
       </w:r>
     </w:p>
-    <w:bookmarkEnd w:id="133"/>
-    <w:bookmarkStart w:id="135" w:name="ref-Duo2020"/>
+    <w:bookmarkEnd w:id="134"/>
+    <w:bookmarkStart w:id="136" w:name="ref-Duo2020"/>
     <w:p>
       <w:pPr>
         <w:pStyle w:val="Bibliography"/>
@@ -11355,7 +11406,7 @@
       <w:r>
         <w:t xml:space="preserve"> </w:t>
       </w:r>
-      <w:hyperlink r:id="rId134">
+      <w:hyperlink r:id="rId135">
         <w:r>
           <w:rPr>
             <w:rStyle w:val="Hyperlink"/>
@@ -11367,8 +11418,8 @@
         <w:t xml:space="preserve">.</w:t>
       </w:r>
     </w:p>
-    <w:bookmarkEnd w:id="135"/>
-    <w:bookmarkStart w:id="137" w:name="ref-Luecken2022"/>
+    <w:bookmarkEnd w:id="136"/>
+    <w:bookmarkStart w:id="138" w:name="ref-Luecken2022"/>
     <w:p>
       <w:pPr>
         <w:pStyle w:val="Bibliography"/>
@@ -11420,7 +11471,7 @@
       <w:r>
         <w:t xml:space="preserve"> </w:t>
       </w:r>
-      <w:hyperlink r:id="rId136">
+      <w:hyperlink r:id="rId137">
         <w:r>
           <w:rPr>
             <w:rStyle w:val="Hyperlink"/>
@@ -11432,8 +11483,8 @@
         <w:t xml:space="preserve">.</w:t>
       </w:r>
     </w:p>
-    <w:bookmarkEnd w:id="137"/>
-    <w:bookmarkStart w:id="139" w:name="ref-Hubert1985"/>
+    <w:bookmarkEnd w:id="138"/>
+    <w:bookmarkStart w:id="140" w:name="ref-Hubert1985"/>
     <w:p>
       <w:pPr>
         <w:pStyle w:val="Bibliography"/>
@@ -11472,7 +11523,7 @@
       <w:r>
         <w:t xml:space="preserve"> </w:t>
       </w:r>
-      <w:hyperlink r:id="rId138">
+      <w:hyperlink r:id="rId139">
         <w:r>
           <w:rPr>
             <w:rStyle w:val="Hyperlink"/>
@@ -11484,8 +11535,8 @@
         <w:t xml:space="preserve">.</w:t>
       </w:r>
     </w:p>
-    <w:bookmarkEnd w:id="139"/>
-    <w:bookmarkStart w:id="141" w:name="ref-Vinh2010"/>
+    <w:bookmarkEnd w:id="140"/>
+    <w:bookmarkStart w:id="142" w:name="ref-Vinh2010"/>
     <w:p>
       <w:pPr>
         <w:pStyle w:val="Bibliography"/>
@@ -11524,7 +11575,7 @@
       <w:r>
         <w:t xml:space="preserve"> </w:t>
       </w:r>
-      <w:hyperlink r:id="rId140">
+      <w:hyperlink r:id="rId141">
         <w:r>
           <w:rPr>
             <w:rStyle w:val="Hyperlink"/>
@@ -11533,8 +11584,8 @@
         </w:r>
       </w:hyperlink>
     </w:p>
-    <w:bookmarkEnd w:id="141"/>
-    <w:bookmarkStart w:id="143" w:name="ref-Squair2021"/>
+    <w:bookmarkEnd w:id="142"/>
+    <w:bookmarkStart w:id="144" w:name="ref-Squair2021"/>
     <w:p>
       <w:pPr>
         <w:pStyle w:val="Bibliography"/>
@@ -11586,7 +11637,7 @@
       <w:r>
         <w:t xml:space="preserve"> </w:t>
       </w:r>
-      <w:hyperlink r:id="rId142">
+      <w:hyperlink r:id="rId143">
         <w:r>
           <w:rPr>
             <w:rStyle w:val="Hyperlink"/>
@@ -11598,8 +11649,8 @@
         <w:t xml:space="preserve">.</w:t>
       </w:r>
     </w:p>
-    <w:bookmarkEnd w:id="143"/>
-    <w:bookmarkStart w:id="145" w:name="ref-Marconato2024"/>
+    <w:bookmarkEnd w:id="144"/>
+    <w:bookmarkStart w:id="146" w:name="ref-Marconato2024"/>
     <w:p>
       <w:pPr>
         <w:pStyle w:val="Bibliography"/>
@@ -11657,7 +11708,7 @@
       <w:r>
         <w:t xml:space="preserve"> </w:t>
       </w:r>
-      <w:hyperlink r:id="rId144">
+      <w:hyperlink r:id="rId145">
         <w:r>
           <w:rPr>
             <w:rStyle w:val="Hyperlink"/>
@@ -11669,8 +11720,8 @@
         <w:t xml:space="preserve">.</w:t>
       </w:r>
     </w:p>
-    <w:bookmarkEnd w:id="145"/>
-    <w:bookmarkStart w:id="147" w:name="ref-Shanmugavelu2024"/>
+    <w:bookmarkEnd w:id="146"/>
+    <w:bookmarkStart w:id="148" w:name="ref-Shanmugavelu2024"/>
     <w:p>
       <w:pPr>
         <w:pStyle w:val="Bibliography"/>
@@ -11727,7 +11778,7 @@
       <w:r>
         <w:t xml:space="preserve"> </w:t>
       </w:r>
-      <w:hyperlink r:id="rId146">
+      <w:hyperlink r:id="rId147">
         <w:r>
           <w:rPr>
             <w:rStyle w:val="Hyperlink"/>
@@ -11739,8 +11790,8 @@
         <w:t xml:space="preserve">.</w:t>
       </w:r>
     </w:p>
-    <w:bookmarkEnd w:id="147"/>
-    <w:bookmarkStart w:id="149" w:name="ref-Collange2015"/>
+    <w:bookmarkEnd w:id="148"/>
+    <w:bookmarkStart w:id="150" w:name="ref-Collange2015"/>
     <w:p>
       <w:pPr>
         <w:pStyle w:val="Bibliography"/>
@@ -11779,7 +11830,7 @@
       <w:r>
         <w:t xml:space="preserve"> </w:t>
       </w:r>
-      <w:hyperlink r:id="rId148">
+      <w:hyperlink r:id="rId149">
         <w:r>
           <w:rPr>
             <w:rStyle w:val="Hyperlink"/>
@@ -11791,8 +11842,8 @@
         <w:t xml:space="preserve">.</w:t>
       </w:r>
     </w:p>
-    <w:bookmarkEnd w:id="149"/>
-    <w:bookmarkStart w:id="151" w:name="ref-Amdahl1967"/>
+    <w:bookmarkEnd w:id="150"/>
+    <w:bookmarkStart w:id="152" w:name="ref-Amdahl1967"/>
     <w:p>
       <w:pPr>
         <w:pStyle w:val="Bibliography"/>
@@ -11837,7 +11888,7 @@
       <w:r>
         <w:t xml:space="preserve"> </w:t>
       </w:r>
-      <w:hyperlink r:id="rId150">
+      <w:hyperlink r:id="rId151">
         <w:r>
           <w:rPr>
             <w:rStyle w:val="Hyperlink"/>
@@ -11849,8 +11900,8 @@
         <w:t xml:space="preserve">.</w:t>
       </w:r>
     </w:p>
-    <w:bookmarkEnd w:id="151"/>
-    <w:bookmarkStart w:id="153" w:name="ref-Williams2009"/>
+    <w:bookmarkEnd w:id="152"/>
+    <w:bookmarkStart w:id="154" w:name="ref-Williams2009"/>
     <w:p>
       <w:pPr>
         <w:pStyle w:val="Bibliography"/>
@@ -11889,7 +11940,7 @@
       <w:r>
         <w:t xml:space="preserve"> </w:t>
       </w:r>
-      <w:hyperlink r:id="rId152">
+      <w:hyperlink r:id="rId153">
         <w:r>
           <w:rPr>
             <w:rStyle w:val="Hyperlink"/>
@@ -11901,9 +11952,9 @@
         <w:t xml:space="preserve">.</w:t>
       </w:r>
     </w:p>
-    <w:bookmarkEnd w:id="153"/>
     <w:bookmarkEnd w:id="154"/>
     <w:bookmarkEnd w:id="155"/>
+    <w:bookmarkEnd w:id="156"/>
     <w:sectPr>
       <w:headerReference r:id="rId9" w:type="default"/>
       <w:footerReference r:id="rId10" w:type="default"/>

</xml_diff>